<commit_message>
Fix navigation links, switch to EN/UR only, add Material icons and company media updates
- Fix Home/nav links breaking on subpages (404 error)
- Replace Durrani Advantage heading with Durrani Group of Companies Advantages
- Remove Pashto language option (EN/Urdu only)
- Replace CEO photos in payment plan/gallery sections with project images
- Remove Professor Model Town picture from Regi Model Town media
- Add Spring Rose Events logo, videos and pictures with location and Google Maps icon
- Add Durrani Garden Landscape image gallery
- Replace emoji/symbol icons with Google Material Icons site-wide
- Fix encoding issues and broken text characters
</commit_message>
<xml_diff>
--- a/Durrani_Group_Notes.docx
+++ b/Durrani_Group_Notes.docx
@@ -156,8 +156,6 @@
       <w:r>
         <w:t>Mazhar</w:t>
       </w:r>
-      <w:bookmarkStart w:id="0" w:name="_GoBack"/>
-      <w:bookmarkEnd w:id="0"/>
       <w:proofErr w:type="spellEnd"/>
       <w:r>
         <w:t xml:space="preserve"> </w:t>
@@ -993,14 +991,147 @@
           <w:b/>
           <w:bCs/>
         </w:rPr>
-        <w:t>location https</w:t>
+        <w:t xml:space="preserve">location </w:t>
+      </w:r>
+      <w:hyperlink r:id="rId7" w:history="1">
+        <w:r>
+          <w:rPr>
+            <w:rStyle w:val="Hyperlink"/>
+            <w:b/>
+            <w:bCs/>
+          </w:rPr>
+          <w:t>https://maps.app.goo.gl/MXguMvktCejbipsj9</w:t>
+        </w:r>
+      </w:hyperlink>
+    </w:p>
+    <w:p>
+      <w:pPr>
+        <w:pStyle w:val="NormalWeb"/>
+        <w:rPr>
+          <w:b/>
+          <w:bCs/>
+        </w:rPr>
+      </w:pPr>
+    </w:p>
+    <w:p>
+      <w:pPr>
+        <w:pStyle w:val="NormalWeb"/>
+        <w:rPr>
+          <w:b/>
+          <w:bCs/>
+        </w:rPr>
+      </w:pPr>
+      <w:proofErr w:type="spellStart"/>
+      <w:r>
+        <w:rPr>
+          <w:b/>
+          <w:bCs/>
+        </w:rPr>
+        <w:t>Sprinr</w:t>
+      </w:r>
+      <w:proofErr w:type="spellEnd"/>
+      <w:r>
+        <w:rPr>
+          <w:b/>
+          <w:bCs/>
+        </w:rPr>
+        <w:t xml:space="preserve"> rose events location map- </w:t>
       </w:r>
       <w:r>
         <w:rPr>
           <w:b/>
           <w:bCs/>
         </w:rPr>
-        <w:t>://maps.app.goo.gl/MXguMvktCejbipsj9</w:t>
+        <w:t xml:space="preserve">2F45+MX, </w:t>
+      </w:r>
+      <w:proofErr w:type="spellStart"/>
+      <w:r>
+        <w:rPr>
+          <w:b/>
+          <w:bCs/>
+        </w:rPr>
+        <w:t>Kacha</w:t>
+      </w:r>
+      <w:proofErr w:type="spellEnd"/>
+      <w:r>
+        <w:rPr>
+          <w:b/>
+          <w:bCs/>
+        </w:rPr>
+        <w:t xml:space="preserve"> </w:t>
+      </w:r>
+      <w:proofErr w:type="spellStart"/>
+      <w:r>
+        <w:rPr>
+          <w:b/>
+          <w:bCs/>
+        </w:rPr>
+        <w:t>Gharay</w:t>
+      </w:r>
+      <w:proofErr w:type="spellEnd"/>
+      <w:r>
+        <w:rPr>
+          <w:b/>
+          <w:bCs/>
+        </w:rPr>
+        <w:t xml:space="preserve"> </w:t>
+      </w:r>
+      <w:proofErr w:type="spellStart"/>
+      <w:r>
+        <w:rPr>
+          <w:b/>
+          <w:bCs/>
+        </w:rPr>
+        <w:t>Malakandher</w:t>
+      </w:r>
+      <w:proofErr w:type="spellEnd"/>
+      <w:r>
+        <w:rPr>
+          <w:b/>
+          <w:bCs/>
+        </w:rPr>
+        <w:t>, Peshawar, Pakistan</w:t>
+      </w:r>
+    </w:p>
+    <w:p>
+      <w:pPr>
+        <w:pStyle w:val="NormalWeb"/>
+        <w:rPr>
+          <w:b/>
+          <w:bCs/>
+        </w:rPr>
+      </w:pPr>
+      <w:proofErr w:type="spellStart"/>
+      <w:r>
+        <w:rPr>
+          <w:b/>
+          <w:bCs/>
+        </w:rPr>
+        <w:t>Instagram</w:t>
+      </w:r>
+      <w:proofErr w:type="spellEnd"/>
+      <w:r>
+        <w:rPr>
+          <w:b/>
+          <w:bCs/>
+        </w:rPr>
+        <w:t>:</w:t>
+      </w:r>
+      <w:bookmarkStart w:id="0" w:name="_GoBack"/>
+      <w:bookmarkEnd w:id="0"/>
+      <w:r>
+        <w:rPr>
+          <w:b/>
+          <w:bCs/>
+        </w:rPr>
+        <w:t xml:space="preserve"> </w:t>
+      </w:r>
+      <w:r>
+        <w:rPr>
+          <w:b/>
+          <w:bCs/>
+        </w:rPr>
+        <w:t>https://l.instagram.com/?u=http%3A%2F%2Fspringroseevents.com%2F&amp;e=AUCLhcQrh9WGZEgngbl30pLzMZ2hGV4a1iilpNt4GzU3IP9yPWO58ns1DO3MAKTN4xheVE7bLSu6Kq61JJ-L3AQ2PsTAKHiMX0_v2_LLhddj2i4UaJmen85VorI-vkoh33fqEb903ER6QVC-pPFmSA</w:t>
       </w:r>
     </w:p>
     <w:sectPr>
@@ -13378,6 +13509,17 @@
       <w:szCs w:val="24"/>
     </w:rPr>
   </w:style>
+  <w:style w:type="character" w:styleId="Hyperlink">
+    <w:name w:val="Hyperlink"/>
+    <w:basedOn w:val="DefaultParagraphFont"/>
+    <w:uiPriority w:val="99"/>
+    <w:unhideWhenUsed/>
+    <w:rsid w:val="00E0300F"/>
+    <w:rPr>
+      <w:color w:val="0000FF" w:themeColor="hyperlink"/>
+      <w:u w:val="single"/>
+    </w:rPr>
+  </w:style>
 </w:styles>
 </file>
 
@@ -25237,6 +25379,17 @@
       <w:rFonts w:ascii="Times New Roman" w:eastAsia="Times New Roman" w:hAnsi="Times New Roman" w:cs="Times New Roman"/>
       <w:sz w:val="24"/>
       <w:szCs w:val="24"/>
+    </w:rPr>
+  </w:style>
+  <w:style w:type="character" w:styleId="Hyperlink">
+    <w:name w:val="Hyperlink"/>
+    <w:basedOn w:val="DefaultParagraphFont"/>
+    <w:uiPriority w:val="99"/>
+    <w:unhideWhenUsed/>
+    <w:rsid w:val="00E0300F"/>
+    <w:rPr>
+      <w:color w:val="0000FF" w:themeColor="hyperlink"/>
+      <w:u w:val="single"/>
     </w:rPr>
   </w:style>
 </w:styles>
@@ -25567,7 +25720,7 @@
 </file>
 
 <file path=customXml/itemProps1.xml><?xml version="1.0" encoding="utf-8"?>
-<ds:datastoreItem xmlns:ds="http://schemas.openxmlformats.org/officeDocument/2006/customXml" ds:itemID="{662657D9-D4E2-4FD6-82F5-DF19A62C8005}">
+<ds:datastoreItem xmlns:ds="http://schemas.openxmlformats.org/officeDocument/2006/customXml" ds:itemID="{BC61952A-C1A2-4EE7-ADA2-FDF583D24404}">
   <ds:schemaRefs>
     <ds:schemaRef ds:uri="http://schemas.openxmlformats.org/officeDocument/2006/bibliography"/>
   </ds:schemaRefs>

</xml_diff>

<commit_message>
Update team photos, add Ijaz Muhammad, reorder areas, rename Shahsaud
</commit_message>
<xml_diff>
--- a/Durrani_Group_Notes.docx
+++ b/Durrani_Group_Notes.docx
@@ -629,16 +629,8 @@
         <w:rPr>
           <w:rStyle w:val="Strong"/>
         </w:rPr>
-        <w:t xml:space="preserve"> Group</w:t>
-      </w:r>
-      <w:r>
-        <w:rPr>
-          <w:rStyle w:val="Strong"/>
-        </w:rPr>
-        <w:t>.</w:t>
-      </w:r>
-      <w:bookmarkStart w:id="0" w:name="_GoBack"/>
-      <w:bookmarkEnd w:id="0"/>
+        <w:t xml:space="preserve"> Group.</w:t>
+      </w:r>
     </w:p>
     <w:p>
       <w:pPr>
@@ -4329,6 +4321,83 @@
       <w:r>
         <w:t>Sales executive/ Property consultant</w:t>
       </w:r>
+    </w:p>
+    <w:p>
+      <w:pPr>
+        <w:pStyle w:val="NoSpacing"/>
+      </w:pPr>
+    </w:p>
+    <w:p>
+      <w:pPr>
+        <w:pStyle w:val="NoSpacing"/>
+        <w:rPr>
+          <w:b/>
+          <w:bCs/>
+        </w:rPr>
+      </w:pPr>
+      <w:proofErr w:type="spellStart"/>
+      <w:r>
+        <w:rPr>
+          <w:b/>
+          <w:bCs/>
+        </w:rPr>
+        <w:t>Ijaz</w:t>
+      </w:r>
+      <w:proofErr w:type="spellEnd"/>
+      <w:r>
+        <w:rPr>
+          <w:b/>
+          <w:bCs/>
+        </w:rPr>
+        <w:t xml:space="preserve"> Muhammad </w:t>
+      </w:r>
+    </w:p>
+    <w:p>
+      <w:pPr>
+        <w:pStyle w:val="NoSpacing"/>
+      </w:pPr>
+      <w:r>
+        <w:t>Contact no: 0</w:t>
+      </w:r>
+      <w:bookmarkStart w:id="0" w:name="_GoBack"/>
+      <w:bookmarkEnd w:id="0"/>
+      <w:r>
+        <w:t>3498756952</w:t>
+      </w:r>
+    </w:p>
+    <w:p>
+      <w:pPr>
+        <w:pStyle w:val="NoSpacing"/>
+      </w:pPr>
+      <w:proofErr w:type="gramStart"/>
+      <w:r>
+        <w:t>Mail :</w:t>
+      </w:r>
+      <w:proofErr w:type="gramEnd"/>
+      <w:r>
+        <w:t xml:space="preserve"> </w:t>
+      </w:r>
+      <w:hyperlink r:id="rId35" w:history="1">
+        <w:r>
+          <w:rPr>
+            <w:rStyle w:val="Hyperlink"/>
+          </w:rPr>
+          <w:t>ijazkhanxada@gmail.com</w:t>
+        </w:r>
+      </w:hyperlink>
+    </w:p>
+    <w:p>
+      <w:pPr>
+        <w:pStyle w:val="NoSpacing"/>
+      </w:pPr>
+      <w:r>
+        <w:t>Graphic Designer and Accounts Officer</w:t>
+      </w:r>
+    </w:p>
+    <w:p>
+      <w:pPr>
+        <w:pStyle w:val="NoSpacing"/>
+      </w:pPr>
     </w:p>
     <w:sectPr>
       <w:pgSz w:w="12240" w:h="15840"/>
@@ -30624,7 +30693,7 @@
 </file>
 
 <file path=customXml/itemProps1.xml><?xml version="1.0" encoding="utf-8"?>
-<ds:datastoreItem xmlns:ds="http://schemas.openxmlformats.org/officeDocument/2006/customXml" ds:itemID="{E7289CD6-B923-4CFB-B988-756EE163626D}">
+<ds:datastoreItem xmlns:ds="http://schemas.openxmlformats.org/officeDocument/2006/customXml" ds:itemID="{F6A3E99B-25C8-4F0A-B0D3-5E481C76D61D}">
   <ds:schemaRefs>
     <ds:schemaRef ds:uri="http://schemas.openxmlformats.org/officeDocument/2006/bibliography"/>
   </ds:schemaRefs>

</xml_diff>